<commit_message>
Refine papers: stand-alone framing + AAPS Average rate-delta clarification
- Drop cross-paper 'companion paper N' / 'see paper 1' references and
  'earlier evaluations' / 'we re-ran' wording so each paper reads as a
  primary publication on its own. Inline the small bits of context each
  paper needed from the others.

- Paper 1 § 1: extend the AAPS Average paragraph to make the rate-delta
  consequence explicit. The value at t is unchanged (raw passes through),
  but t-1 is averaged once t arrives, so the slope into t reads
  raw(t) - smoothed(t-1) rather than raw(t) - raw(t-1). The rate delta
  into t is therefore modified even though the value at t itself is not.
</commit_message>
<xml_diff>
--- a/papers/01_cohort_backtest.docx
+++ b/papers/01_cohort_backtest.docx
@@ -151,7 +151,7 @@
     </w:p>
     <w:p>
       <w:r>
-        <w:t xml:space="preserve">Production AAPS instantiates a fresh smoother on every loop tick (every five minutes) and feeds it a sliding window of the most recent N readings — N = 24 for AAPS Exponential, N = 36 (≈ 3 hours) for the UKF as configured in the development branches that compile this filter. The dose engine then reads the smoothed value the algorithm produces for the newest reading in that window and uses that as its "current glucose". Earlier evaluations of these algorithms typically run a single offline call over the full 90-day series and study the resulting smoothed curve. This is computationally convenient but does not reflect what the AID actually sees: in production, the </w:t>
+        <w:t xml:space="preserve">Production AAPS instantiates a fresh smoother on every loop tick (every five minutes) and feeds it a sliding window of the most recent N readings — N = 24 for AAPS Exponential, N = 36 (≈ 3 hours) for the UKF as configured in the development branches that compile this filter. The dose engine then reads the smoothed value the algorithm produces for the newest reading in that window and uses that as its "current glucose". A single offline call over the full series produces a different curve from the sliding-window evaluation that runs in production; the </w:t>
       </w:r>
       <w:r>
         <w:rPr>
@@ -160,7 +160,7 @@
         <w:t>operationally relevant</w:t>
       </w:r>
       <w:r>
-        <w:t xml:space="preserve"> output is the leading-edge value of each sliding-window call.</w:t>
+        <w:t xml:space="preserve"> output is the leading-edge value of each sliding-window call, not the offline pass.</w:t>
       </w:r>
     </w:p>
     <w:p>
@@ -225,7 +225,27 @@
         <w:t>data[0].value</w:t>
       </w:r>
       <w:r>
-        <w:t xml:space="preserve"> (the raw input) when no smoothed value is set. So at decision time t the AID using AAPS Average sees the raw glucose t — the algorithm has no impact on the current reading. It does retroactively smooth past readings (t − 1 gets averaged once t arrives), which can affect rate-of-change calculations, but does not modify the value that drives the next dose.</w:t>
+        <w:t xml:space="preserve"> (the raw input) when no smoothed value is set. So at decision time t the AID using AAPS Average sees the raw glucose t — the value at t is unchanged. The algorithm does, however, write a smoothed value to t − 1 once t arrives (the three-point average uses t, t − 1 and t − 2), which means the rate-of-change calculation between "now" and "five minutes ago" reads </w:t>
+      </w:r>
+      <w:r>
+        <w:rPr>
+          <w:rFonts w:ascii="Menlo" w:hAnsi="Menlo"/>
+          <w:sz w:val="20"/>
+        </w:rPr>
+        <w:t>raw(t) − smoothed(t − 1)</w:t>
+      </w:r>
+      <w:r>
+        <w:t xml:space="preserve"> rather than </w:t>
+      </w:r>
+      <w:r>
+        <w:rPr>
+          <w:rFonts w:ascii="Menlo" w:hAnsi="Menlo"/>
+          <w:sz w:val="20"/>
+        </w:rPr>
+        <w:t>raw(t) − raw(t − 1)</w:t>
+      </w:r>
+      <w:r>
+        <w:t>. The rate delta into t is therefore modified even though the value at t itself is not — a single-reading spike at t − 1 that would otherwise distort the slope is dampened by the time the AID computes that slope at t.</w:t>
       </w:r>
     </w:p>
     <w:p>
@@ -2121,7 +2141,7 @@
     </w:p>
     <w:p>
       <w:r>
-        <w:t>The Sensor Integrity Detection (SID) v6 logic looks for sustained glucose-deviation events that suggest a sensor problem (compression, calibration drift). We re-ran SID against each smoother's output to count surviving events. The headline numbers across the cohort are:</w:t>
+        <w:t>The Sensor Integrity Detection (SID) v6 logic looks for sustained glucose-deviation events that suggest a sensor problem (compression, calibration drift). We ran SID against each smoother's output to count surviving events. The headline numbers across the cohort are:</w:t>
       </w:r>
     </w:p>
     <w:p>

</xml_diff>

<commit_message>
Drop the offline-pass scaffolding and fix the window-size sentence
The previous abstract and § 1 said production AAPS calls each smoother
"with the trailing 24 or 36 readings" — but AAPS Average has a 3-point
window, not 24 or 36. Spelt the windows out per algorithm:
  - AAPS Average: 3-point central window
  - AAPS Exponential: trailing 24 readings
  - UKF: trailing 36 readings

Also dropped the "vs a single offline pass" framing from the abstract,
§ 1 and § 4.1. The paper just describes the production-realistic
sliding-window evaluation directly; comparing against a hypothetical
offline pass that the paper does not actually report is unnecessary
scaffolding.
</commit_message>
<xml_diff>
--- a/papers/01_cohort_backtest.docx
+++ b/papers/01_cohort_backtest.docx
@@ -65,7 +65,7 @@
         <w:t>ExponentialSmoothingPlugin</w:t>
       </w:r>
       <w:r>
-        <w:t xml:space="preserve">, marketed in some forks as TSUNAMI), and an adaptive Unscented Kalman Filter with a Rauch–Tung–Striebel (RTS) backward sweep. We re-implemented each algorithm from the upstream Kotlin source, validated each Python port against the original Kotlin reference to bit-exactness (or sub-mg/dL tolerance for the floating-point UKF), and ran each smoother across a 19-user, 90-day cohort drawn from a research database of oref0-style closed-loop sessions. Critically, we evaluated each algorithm in </w:t>
+        <w:t xml:space="preserve">, marketed in some forks as TSUNAMI) over a trailing 24-reading window, and an adaptive Unscented Kalman Filter with a Rauch–Tung–Striebel (RTS) backward sweep over a trailing 36-reading window. We re-implemented each algorithm from the upstream Kotlin source, validated each Python port against the original Kotlin reference to bit-exactness (or sub-mg/dL tolerance for the floating-point UKF), and ran each smoother across a 19-user, 90-day cohort drawn from a research database of oref0-style closed-loop sessions in </w:t>
       </w:r>
       <w:r>
         <w:rPr>
@@ -74,7 +74,7 @@
         <w:t>online sliding-window mode</w:t>
       </w:r>
       <w:r>
-        <w:t xml:space="preserve"> — at every chronological reading t, the smoother is asked the value the AID dose engine would actually see at decision time t — rather than as a single offline pass. This changes the picture qualitatively for AAPS Average, which never sets a smoothed value for the newest reading in any call: in production the dose engine reads the raw value, and the algorithm has zero leading-edge effect on the current reading. AAPS Exponential and the UKF do produce a smoothed leading-edge value. Across the cohort, AAPS Exponential reduced step-to-step noise by a median of 16 % at the cost of a 1.7-minute phase shift, with 7.1 percentage points of &lt; 70 mg/dL events not preserved at the leading edge; the UKF reduced noise by 18 % with a phase shift of 0.85 minutes and 3.4 percentage points of hypo events not preserved (AAPS Average preserves all events at the leading edge because it does not smooth the current reading). On a per-user paired noise-versus-phase plot, the UKF lies at smaller phase delay than AAPS Exponential with overlapping noise-reduction ranges, and achieves at least as much noise reduction at smaller phase delay as AAPS Exponential for 14 of 19 users. UKF absorbed 38 % of raw outliers vs 30 % for AAPS Exponential and 0 % for AAPS Average at the leading edge. We discuss what this means for AID design: a smoother that does not act on the current reading is operationally a no-op for the most safety-critical decision (treating now), whatever it does to the historical view of the curve.</w:t>
+        <w:t xml:space="preserve"> — at every chronological reading t, the smoother is asked the value the AID dose engine would actually see at decision time t. The picture is qualitatively different for AAPS Average, which never sets a smoothed value for the newest reading in any call: in production the dose engine reads the raw value, and the algorithm has zero leading-edge effect on the current reading. AAPS Exponential and the UKF do produce a smoothed leading-edge value. Across the cohort, AAPS Exponential reduced step-to-step noise by a median of 16 % at the cost of a 1.7-minute phase shift, with 7.1 percentage points of &lt; 70 mg/dL events not preserved at the leading edge; the UKF reduced noise by 18 % with a phase shift of 0.85 minutes and 3.4 percentage points of hypo events not preserved (AAPS Average preserves all events at the leading edge because it does not smooth the current reading). On a per-user paired noise-versus-phase plot, the UKF lies at smaller phase delay than AAPS Exponential with overlapping noise-reduction ranges, and achieves at least as much noise reduction at smaller phase delay as AAPS Exponential for 14 of 19 users. UKF absorbed 38 % of raw outliers vs 30 % for AAPS Exponential and 0 % for AAPS Average at the leading edge. We discuss what this means for AID design: a smoother that does not act on the current reading is operationally a no-op for the most safety-critical decision (treating now), whatever it does to the historical view of the curve.</w:t>
       </w:r>
     </w:p>
     <w:p>
@@ -151,16 +151,7 @@
     </w:p>
     <w:p>
       <w:r>
-        <w:t xml:space="preserve">Production AAPS instantiates a fresh smoother on every loop tick (every five minutes) and feeds it a sliding window of the most recent N readings — N = 24 for AAPS Exponential, N = 36 (≈ 3 hours) for the UKF as configured in the development branches that compile this filter. The dose engine then reads the smoothed value the algorithm produces for the newest reading in that window and uses that as its "current glucose". A single offline call over the full series produces a different curve from the sliding-window evaluation that runs in production; the </w:t>
-      </w:r>
-      <w:r>
-        <w:rPr>
-          <w:i/>
-        </w:rPr>
-        <w:t>operationally relevant</w:t>
-      </w:r>
-      <w:r>
-        <w:t xml:space="preserve"> output is the leading-edge value of each sliding-window call, not the offline pass.</w:t>
+        <w:t>Production AAPS instantiates a fresh smoother on every loop tick (every five minutes). AAPS Average is fed the trailing reading history and acts on a three-point window centred on each interior position; AAPS Exponential is fed the trailing 24 readings and runs its dual-EMA across them; the UKF is fed the trailing 36 readings (≈ 3 hours) as configured in the development branch that compiles this filter. The dose engine then reads the smoothed value the algorithm produces for the newest reading in that window and uses that as its "current glucose". The operationally relevant output is therefore the leading-edge value of each sliding-window call.</w:t>
       </w:r>
     </w:p>
     <w:p>
@@ -2414,7 +2405,7 @@
     </w:p>
     <w:p>
       <w:r>
-        <w:t>We are not arguing that one stance is inherently better. We are arguing that any cohort comparison of these algorithms that runs them as offline batch passes will report misleadingly large effects for AAPS Average — every interior reading appears smoothed, including the current — when in practice the algorithm's online effect on the current-reading is zero.</w:t>
+        <w:t>We are not arguing that one stance is inherently better. The smoothed values committed to past readings still affect the AID's slope calculations and historical view of the curve; the only operational claim about AAPS Average is that the value at t itself is not modified.</w:t>
       </w:r>
     </w:p>
     <w:p>

</xml_diff>

<commit_message>
Three abstract / introduction fixes
1. UKF window: replaced "trailing 36-reading window" with "configurable
   trailing window in the 24–48 reading range; we used 36 in this
   analysis". The 36 was a default we picked, not an algorithmic
   property. Same correction in the methods section and the meal-event
   methods.

2. AAPS Average abstract sentence: "The picture changes most for AAPS
   Average, whose production loop never sets a smoothed value..." had
   no antecedent for "the picture changes" once the offline-pass
   framing was removed. Rewrote as a self-contained statement of what
   the production loop does and what the dose engine reads.

3. Removed the SID sentence from the abstract entirely. The SID
   re-detection result lives in § 3.4/§ 3.5 of the body where it has
   the room to be properly contextualised; including it in the
   abstract overweights it for a smoother-evaluation paper.
</commit_message>
<xml_diff>
--- a/papers/01_cohort_backtest.docx
+++ b/papers/01_cohort_backtest.docx
@@ -65,7 +65,7 @@
         <w:t>ExponentialSmoothingPlugin</w:t>
       </w:r>
       <w:r>
-        <w:t xml:space="preserve">, marketed in some forks as TSUNAMI) over a trailing 24-reading window, and an adaptive Unscented Kalman Filter with a Rauch–Tung–Striebel (RTS) backward sweep over a trailing 36-reading window. We re-implemented each algorithm from the upstream Kotlin source, validated each Python port against the original Kotlin reference to bit-exactness (or sub-mg/dL tolerance for the floating-point UKF), and ran each smoother across a 19-user, 90-day cohort drawn from a research database of oref0-style closed-loop sessions in </w:t>
+        <w:t xml:space="preserve">, marketed in some forks as TSUNAMI) over a trailing 24-reading window, and an adaptive Unscented Kalman Filter with a Rauch–Tung–Striebel (RTS) backward sweep over a configurable trailing window in the 24–48 reading range (we used 36 here). We re-implemented each algorithm from the upstream Kotlin source, validated each Python port against the original Kotlin reference to bit-exactness (or sub-mg/dL tolerance for the floating-point UKF), and ran each smoother across a 19-user, 90-day cohort drawn from a research database of oref0-style closed-loop sessions in </w:t>
       </w:r>
       <w:r>
         <w:rPr>
@@ -74,7 +74,7 @@
         <w:t>online sliding-window mode</w:t>
       </w:r>
       <w:r>
-        <w:t xml:space="preserve"> — at every chronological reading t, the smoother is asked the value the AID dose engine would actually see at decision time t. The picture is qualitatively different for AAPS Average, which never sets a smoothed value for the newest reading in any call: in production the dose engine reads the raw value, and the algorithm has zero leading-edge effect on the current reading. AAPS Exponential and the UKF do produce a smoothed leading-edge value. Across the cohort, AAPS Exponential reduced step-to-step noise by a median of 16 % at the cost of a 1.7-minute phase shift, with 7.1 percentage points of &lt; 70 mg/dL events not preserved at the leading edge; the UKF reduced noise by 18 % with a phase shift of 0.85 minutes and 3.4 percentage points of hypo events not preserved (AAPS Average preserves all events at the leading edge because it does not smooth the current reading). On a per-user paired noise-versus-phase plot, the UKF lies at smaller phase delay than AAPS Exponential with overlapping noise-reduction ranges, and achieves at least as much noise reduction at smaller phase delay as AAPS Exponential for 14 of 19 users. UKF absorbed 38 % of raw outliers vs 30 % for AAPS Exponential and 0 % for AAPS Average at the leading edge. We discuss what this means for AID design: a smoother that does not act on the current reading is operationally a no-op for the most safety-critical decision (treating now), whatever it does to the historical view of the curve.</w:t>
+        <w:t xml:space="preserve"> — at every chronological reading t, the smoother is asked the value the AID dose engine would actually see at decision time t. AAPS Average's production loop iterates over interior positions only and never writes a smoothed value to the newest reading; in production the dose engine reads the raw value at decision time, and the algorithm has zero leading-edge effect on the current reading. AAPS Exponential and the UKF do produce a smoothed leading-edge value. Across the cohort, AAPS Exponential reduced step-to-step noise by a median of 16 % at the cost of a 1.7-minute phase shift, with 7.1 percentage points of &lt; 70 mg/dL events not preserved at the leading edge; the UKF reduced noise by 18 % with a phase shift of 0.85 minutes and 3.4 percentage points of hypo events not preserved (AAPS Average preserves all events at the leading edge because it does not smooth the current reading). On a per-user paired noise-versus-phase plot, the UKF lies at smaller phase delay than AAPS Exponential with overlapping noise-reduction ranges, and achieves at least as much noise reduction at smaller phase delay as AAPS Exponential for 14 of 19 users. UKF absorbed 38 % of raw outliers vs 30 % for AAPS Exponential and 0 % for AAPS Average at the leading edge. We discuss what this means for AID design: a smoother that does not act on the current reading is operationally a no-op for the most safety-critical decision (treating now), whatever it does to the historical view of the curve.</w:t>
       </w:r>
     </w:p>
     <w:p>
@@ -151,7 +151,7 @@
     </w:p>
     <w:p>
       <w:r>
-        <w:t>Production AAPS instantiates a fresh smoother on every loop tick (every five minutes). AAPS Average is fed the trailing reading history and acts on a three-point window centred on each interior position; AAPS Exponential is fed the trailing 24 readings and runs its dual-EMA across them; the UKF is fed the trailing 36 readings (≈ 3 hours) as configured in the development branch that compiles this filter. The dose engine then reads the smoothed value the algorithm produces for the newest reading in that window and uses that as its "current glucose". The operationally relevant output is therefore the leading-edge value of each sliding-window call.</w:t>
+        <w:t>Production AAPS instantiates a fresh smoother on every loop tick (every five minutes). AAPS Average is fed the trailing reading history and acts on a three-point window centred on each interior position; AAPS Exponential is fed the trailing 24 readings and runs its dual-EMA across them; the UKF window in the development branch is configurable in the 24–48 reading range (≈ 2–4 hours), and we used 36 readings here. The dose engine then reads the smoothed value the algorithm produces for the newest reading in that window and uses that as its "current glucose". The operationally relevant output is therefore the leading-edge value of each sliding-window call.</w:t>
       </w:r>
     </w:p>
     <w:p>

</xml_diff>

<commit_message>
Reframe all papers around UKF shipping question; add visual comparison figure
- Retitle papers 01–04 to lead with "Is the UKF worth adding?" framing
- Update abstracts and conclusions across all papers to answer the question
  directly rather than presenting a neutral trade-off
- Papers 02 and 03 now connect their sensor-type and meal-event findings
  back to the central UKF question
- Paper 04 framed as data-quality foundation for papers 01–03
- Add four-panel smoother_comparison_figure.py and smoother_comparison.png:
  real CGM windows showing jitter reduction, tracking lag, spike absorption
  and hypo detection side by side for all three smoothers
- Embed comparison figure as Figure 1 in paper 01 (diabettech version)

Co-Authored-By: Claude Sonnet 4.6 <noreply@anthropic.com>
</commit_message>
<xml_diff>
--- a/papers/01_cohort_backtest.docx
+++ b/papers/01_cohort_backtest.docx
@@ -12,7 +12,7 @@
           <w:color w:val="1A4773"/>
           <w:sz w:val="40"/>
         </w:rPr>
-        <w:t>Production-Realistic Evaluation of CGM Smoothing Algorithms in Open-Source Automated Insulin Delivery</w:t>
+        <w:t>Is the Adaptive UKF Worth Adding to AAPS and Trio? A Production-Realistic Cohort Evaluation</w:t>
       </w:r>
     </w:p>
     <w:p>
@@ -24,7 +24,7 @@
           <w:i/>
           <w:color w:val="555555"/>
         </w:rPr>
-        <w:t>Cohort backtest of three smoothing algorithms used in oref0-derived AID systems, evaluated as the algorithms run in production: a sliding window applied to each new reading.</w:t>
+        <w:t>Signal-level evaluation of three CGM smoothing algorithms in oref0-derived AID systems, run as production calls them — a fresh sliding-window calculation at every loop tick — asking whether the UKF's characteristics justify shipping it as an alternative to AAPS Exponential.</w:t>
       </w:r>
     </w:p>
     <w:p>
@@ -45,7 +45,7 @@
     </w:p>
     <w:p>
       <w:r>
-        <w:t>This paper evaluates three CGM smoothing algorithms used by open-source automated insulin delivery (AID) systems built on the oref0 algorithm: the AAPS three-point central-window average (</w:t>
+        <w:t>The Adaptive Unscented Kalman Filter (UKF) with Rauch–Tung–Striebel (RTS) backward sweep is currently in an AAPS development branch and has not shipped in a stable AAPS or Trio release. This paper asks whether the signal-level evidence supports adding it. We re-implemented the UKF alongside the two production smoothers — the AAPS three-point central-window average (</w:t>
       </w:r>
       <w:r>
         <w:rPr>
@@ -55,7 +55,7 @@
         <w:t>AvgSmoothingPlugin</w:t>
       </w:r>
       <w:r>
-        <w:t>), the AAPS dual-order exponential (</w:t>
+        <w:t>) and the AAPS dual-order exponential (</w:t>
       </w:r>
       <w:r>
         <w:rPr>
@@ -65,7 +65,7 @@
         <w:t>ExponentialSmoothingPlugin</w:t>
       </w:r>
       <w:r>
-        <w:t xml:space="preserve">, marketed in some forks as TSUNAMI) over a trailing 24-reading window, and an adaptive Unscented Kalman Filter with a Rauch–Tung–Striebel (RTS) backward sweep over a configurable trailing window in the 24–48 reading range (we used 36 here). We re-implemented each algorithm from the upstream Kotlin source, validated each Python port against the original Kotlin reference to bit-exactness (or sub-mg/dL tolerance for the floating-point UKF), and ran each smoother across a 19-user, 90-day cohort drawn from a research database of oref0-style closed-loop sessions in </w:t>
+        <w:t xml:space="preserve">, TSUNAMI) — validated each Python port against the upstream Kotlin source to bit-exactness or sub-mg/dL tolerance, and ran all three across a 19-user, 90-day cohort in </w:t>
       </w:r>
       <w:r>
         <w:rPr>
@@ -74,7 +74,22 @@
         <w:t>online sliding-window mode</w:t>
       </w:r>
       <w:r>
-        <w:t xml:space="preserve"> — at every chronological reading t, the smoother is asked the value the AID dose engine would actually see at decision time t. AAPS Average's production loop iterates over interior positions only and never writes a smoothed value to the newest reading; in production the dose engine reads the raw value at decision time, and the algorithm has zero leading-edge effect on the current reading. AAPS Exponential and the UKF do produce a smoothed leading-edge value. Across the cohort, AAPS Exponential reduced step-to-step noise by a median of 16 % at the cost of a 1.7-minute phase shift, with 7.1 percentage points of &lt; 70 mg/dL events not preserved at the leading edge; the UKF reduced noise by 18 % with a phase shift of 0.85 minutes and 3.4 percentage points of hypo events not preserved (AAPS Average preserves all events at the leading edge because it does not smooth the current reading). On a per-user paired noise-versus-phase plot, the UKF lies at smaller phase delay than AAPS Exponential with overlapping noise-reduction ranges, and achieves at least as much noise reduction at smaller phase delay as AAPS Exponential for 14 of 19 users. UKF absorbed 38 % of raw outliers vs 30 % for AAPS Exponential and 0 % for AAPS Average at the leading edge. We discuss what this means for AID design: a smoother that does not act on the current reading is operationally a no-op for the most safety-critical decision (treating now), whatever it does to the historical view of the curve.</w:t>
+        <w:t>: at every chronological reading t the smoother is asked the value the AID dose engine would see at decision time t.</w:t>
+      </w:r>
+    </w:p>
+    <w:p>
+      <w:r>
+        <w:t>On every metric where AAPS Exponential improves on raw, the UKF improves further. It reduces step-to-step noise by 18% (versus 16% for AAPS Exponential) with a phase delay of 0.85 minutes (versus 1.7 minutes — roughly half the lag). It preserves 96.6% of raw low-glucose events at the leading edge versus 92.9% for AAPS Exponential, absorbs 38% of large single-reading outliers versus 30%, and on a per-user paired comparison achieves at least as much noise reduction at smaller phase delay for 14 of 19 users. Neither adaptive smoother dampens real multi-hour glucose dynamics. The one metric where AAPS Exponential outperforms the UKF is sensor-integrity alert count (1 259 versus 2 416), a consequence of AAPS Exponential's larger lag making the smoothed trace less sensitive to genuine glucose excursions — whether this represents fewer false alarms or more missed real sensor problems cannot be determined without ground-truth labels.</w:t>
+      </w:r>
+    </w:p>
+    <w:p>
+      <w:r>
+        <w:t>AAPS Average produces a smoothed leading-edge value for neither the current reading nor recent readings in time for the current dose decision; the dose engine reads raw at decision time. Its role is in cleaning the historical curve and damping the slope calculation.</w:t>
+      </w:r>
+    </w:p>
+    <w:p>
+      <w:r>
+        <w:t>Subject to the caveat that no clinical outcome data is available and the UKF parameter set is not yet finalised, the signal-level evidence supports shipping the UKF as a user-selectable alternative to AAPS Exponential in AAPS and Trio. The appropriate next step is to run the full oref0 dose engine downstream of each smoother and compare the resulting insulin delivery decisions.</w:t>
       </w:r>
     </w:p>
     <w:p>
@@ -2556,7 +2571,27 @@
     </w:p>
     <w:p>
       <w:r>
-        <w:t>In a production-realistic online sliding-window evaluation across 19 users and up to 90 days each, the three CGM smoothers used by oref0-derived AID systems show distinct operating points. AAPS Average is a no-op for the current reading at decision time and exists primarily to clean the historical view of the curve and dampen the slope into t. AAPS Exponential reduces step-to-step noise by 16 % at a cost of a 1.7-minute phase shift and 7.1 percentage points of &lt; 70 mg/dL events not preserved at the leading edge. The adaptive UKF reduces noise by 18 % at half the phase shift (0.85 min), with 3.4 percentage points of hypo events not preserved (lower than AAPS Exponential; AAPS Average preserves all events because it does not smooth the leading edge). On a per-user paired noise-versus-phase comparison the UKF lies on the lower-delay side of AAPS Exponential, with at least as much noise reduction at smaller phase delay than AAPS Exponential for 14 of 19 users; for the remaining 5 users AAPS Exponential has marginally lower noise ratio. The UKF's RTS backward smoother contributes effectively nothing to the current-reading value (RTS does not modify the leading edge by construction); its effect is on the historical curve, not the dose-engine input. The choice of smoother for an AID design is a choice about how much delay to accept on the current reading in exchange for fewer single-reading dose perturbations; this paper does not argue that one smoother is clinically better than another.</w:t>
+        <w:t>The signal-level evidence from this 19-user, 90-day production-realistic evaluation supports adding the Adaptive UKF to AAPS and Trio as a user-selectable alternative to AAPS Exponential.</w:t>
+      </w:r>
+    </w:p>
+    <w:p>
+      <w:r>
+        <w:t>The UKF reduces step-to-step noise by 18% at a phase delay of 0.85 minutes. AAPS Exponential reduces noise by 16% at 1.7 minutes of phase delay — roughly twice the lag at slightly less noise reduction. The UKF preserves 96.6% of raw low-glucose events at the leading edge versus 92.9% for AAPS Exponential, absorbs 38% of large single-reading outliers versus 30%, and on a per-user paired comparison achieves at least as much noise reduction at smaller phase delay for 14 of 19 users. Its RTS backward sweep contributes nothing to the current-reading value the dose engine acts on (RTS by construction does not modify the leading edge); its effect is on the historical curve. Neither adaptive smoother dampens real multi-hour glucose dynamics (signal-band attenuation ≈ 1.03 for both, consistent with no real-trend suppression).</w:t>
+      </w:r>
+    </w:p>
+    <w:p>
+      <w:r>
+        <w:t>The one metric where AAPS Exponential outperforms the UKF — sensor-integrity alert count (1 259 versus 2 416) — is a consequence of AAPS Exponential's larger phase lag causing the smoothed trace to follow genuine glucose excursions more loosely, which reduces how often a sustained deviation triggers an alert. Whether this means fewer false alarms or more missed real problems depends on ground-truth labels not available in this dataset. It does not, by itself, argue against the UKF.</w:t>
+      </w:r>
+    </w:p>
+    <w:p>
+      <w:r>
+        <w:t>AAPS Average is a no-op at the current reading at decision time and is not a meaningful alternative to the adaptive smoothers for the dose-engine glucose value; its role is cleaning the historical curve and damping slope calculations.</w:t>
+      </w:r>
+    </w:p>
+    <w:p>
+      <w:r>
+        <w:t>The appropriate next step is to run the full oref0 dose engine downstream of each smoother on this cohort and compare the resulting insulin delivery decisions. Signal metrics are plausible proxies for clinical relevance; dose-level comparison is the direct test. The UKF parameter set should be finalised before a stable release. The full pipeline is reproducible from the repository.</w:t>
       </w:r>
     </w:p>
     <w:sectPr>

</xml_diff>